<commit_message>
Manuscript references: add DOIs; Cureus reference list for the online editor
Co-Authored-By: Claude Opus 5.5 <noreply@anthropic.com>
</commit_message>
<xml_diff>
--- a/paper/cureus/Manuscript_Cureus.docx
+++ b/paper/cureus/Manuscript_Cureus.docx
@@ -12295,7 +12295,7 @@
       </w:r>
       <w:bookmarkEnd w:id="31"/>
     </w:p>
-    <w:bookmarkStart w:id="59" w:name="_refs"/>
+    <w:bookmarkStart w:id="67" w:name="_refs"/>
     <w:bookmarkStart w:id="32" w:name="_891bd0618677fbaff9555cad9408ba6779b4c16"/>
     <w:p>
       <w:pPr>
@@ -12546,7 +12546,7 @@
       </w:r>
     </w:p>
     <w:bookmarkEnd w:id="45"/>
-    <w:bookmarkStart w:id="46" w:name="_d1a995e786a46bed3b801609c886c4520897df8"/>
+    <w:bookmarkStart w:id="47" w:name="_d1a995e786a46bed3b801609c886c4520897df8"/>
     <w:p>
       <w:pPr>
         <w:pStyle w:val="Bibliography"/>
@@ -12554,113 +12554,211 @@
       <w:r>
         <w:t xml:space="preserve">10. Deming WE, Stephan FF. On a least squares adjustment of a sampled frequency table when the expected marginal totals are known. Annals of Mathematical Statistics. 1940;11:427–44.</w:t>
       </w:r>
-    </w:p>
-    <w:bookmarkEnd w:id="46"/>
-    <w:bookmarkStart w:id="47" w:name="_f0ba6b4abf465e8b253040d0875708981a2fd4c"/>
-    <w:p>
-      <w:pPr>
-        <w:pStyle w:val="Bibliography"/>
-      </w:pPr>
-      <w:r>
-        <w:t xml:space="preserve">11. Rubin DB. Statistical disclosure limitation. Journal of Official Statistics. 1993;9:461–8.</w:t>
+      <w:r>
+        <w:t xml:space="preserve"> </w:t>
+      </w:r>
+      <w:hyperlink r:id="rId46">
+        <w:r>
+          <w:rPr>
+            <w:rStyle w:val="Hyperlink"/>
+          </w:rPr>
+          <w:t xml:space="preserve">https://doi.org/10.1214/aoms/1177731829</w:t>
+        </w:r>
+      </w:hyperlink>
+      <w:r>
+        <w:t xml:space="preserve">.</w:t>
       </w:r>
     </w:p>
     <w:bookmarkEnd w:id="47"/>
-    <w:bookmarkStart w:id="48" w:name="_2f1a70716496c83e2e6a8c6df7d5edf09a024c5"/>
+    <w:bookmarkStart w:id="48" w:name="_f0ba6b4abf465e8b253040d0875708981a2fd4c"/>
     <w:p>
       <w:pPr>
         <w:pStyle w:val="Bibliography"/>
       </w:pPr>
       <w:r>
-        <w:t xml:space="preserve">12. Raghunathan TE, Reiter JP, Rubin DB. Multiple imputation for statistical disclosure limitation. Journal of Official Statistics. 2003;19:1–16.</w:t>
+        <w:t xml:space="preserve">11. Rubin DB. Statistical disclosure limitation. Journal of Official Statistics. 1993;9:461–8.</w:t>
       </w:r>
     </w:p>
     <w:bookmarkEnd w:id="48"/>
-    <w:bookmarkStart w:id="49" w:name="_e1ee69be21339cb7886103462959c41dd687335"/>
+    <w:bookmarkStart w:id="49" w:name="_2f1a70716496c83e2e6a8c6df7d5edf09a024c5"/>
     <w:p>
       <w:pPr>
         <w:pStyle w:val="Bibliography"/>
       </w:pPr>
       <w:r>
-        <w:t xml:space="preserve">13. Barros AJD, Victora CG. Measuring coverage in</w:t>
-      </w:r>
-      <w:r>
-        <w:t xml:space="preserve"> </w:t>
-      </w:r>
-      <w:r>
-        <w:t xml:space="preserve">MNCH</w:t>
-      </w:r>
-      <w:r>
-        <w:t xml:space="preserve">: Determining and interpreting inequalities in coverage of maternal, newborn, and child health interventions. PLoS Medicine. 2013;10:e1001390.</w:t>
+        <w:t xml:space="preserve">12. Raghunathan TE, Reiter JP, Rubin DB. Multiple imputation for statistical disclosure limitation. Journal of Official Statistics. 2003;19:1–16.</w:t>
       </w:r>
     </w:p>
     <w:bookmarkEnd w:id="49"/>
-    <w:bookmarkStart w:id="50" w:name="_82fdf24c54b33d46461562f9224269bcf5c6e6c"/>
+    <w:bookmarkStart w:id="51" w:name="_e1ee69be21339cb7886103462959c41dd687335"/>
     <w:p>
       <w:pPr>
         <w:pStyle w:val="Bibliography"/>
       </w:pPr>
       <w:r>
-        <w:t xml:space="preserve">14. Wagstaff A, Paci P, Doorslaer E van. On the measurement of inequalities in health. Social Science &amp; Medicine. 1991;33:545–57.</w:t>
-      </w:r>
-    </w:p>
-    <w:bookmarkEnd w:id="50"/>
-    <w:bookmarkStart w:id="51" w:name="_233e291a6f1aaf96c93131d92b645060ec50345"/>
-    <w:p>
-      <w:pPr>
-        <w:pStyle w:val="Bibliography"/>
-      </w:pPr>
-      <w:r>
-        <w:t xml:space="preserve">15. Kakwani N, Wagstaff A, Doorslaer E van. Socioeconomic inequalities in health: Measurement, computation, and statistical inference. Journal of Econometrics. 1997;77:87–103.</w:t>
+        <w:t xml:space="preserve">13. Barros AJD, Victora CG. Measuring coverage in</w:t>
+      </w:r>
+      <w:r>
+        <w:t xml:space="preserve"> </w:t>
+      </w:r>
+      <w:r>
+        <w:t xml:space="preserve">MNCH</w:t>
+      </w:r>
+      <w:r>
+        <w:t xml:space="preserve">: Determining and interpreting inequalities in coverage of maternal, newborn, and child health interventions. PLoS Medicine. 2013;10:e1001390.</w:t>
+      </w:r>
+      <w:r>
+        <w:t xml:space="preserve"> </w:t>
+      </w:r>
+      <w:hyperlink r:id="rId50">
+        <w:r>
+          <w:rPr>
+            <w:rStyle w:val="Hyperlink"/>
+          </w:rPr>
+          <w:t xml:space="preserve">https://doi.org/10.1371/journal.pmed.1001390</w:t>
+        </w:r>
+      </w:hyperlink>
+      <w:r>
+        <w:t xml:space="preserve">.</w:t>
       </w:r>
     </w:p>
     <w:bookmarkEnd w:id="51"/>
-    <w:bookmarkStart w:id="52" w:name="_0144a4205edfd9fda0fabce33164bcf554f451b"/>
+    <w:bookmarkStart w:id="53" w:name="_82fdf24c54b33d46461562f9224269bcf5c6e6c"/>
     <w:p>
       <w:pPr>
         <w:pStyle w:val="Bibliography"/>
       </w:pPr>
       <w:r>
-        <w:t xml:space="preserve">16. Erreygers G. Correcting the concentration index. Journal of Health Economics. 2009;28:504–15.</w:t>
-      </w:r>
-    </w:p>
-    <w:bookmarkEnd w:id="52"/>
-    <w:bookmarkStart w:id="53" w:name="_2096ada8637f754eda80ca982d41947deba1be0"/>
-    <w:p>
-      <w:pPr>
-        <w:pStyle w:val="Bibliography"/>
-      </w:pPr>
-      <w:r>
-        <w:t xml:space="preserve">17. Kitagawa EM. Components of a difference between two rates. Journal of the American Statistical Association. 1955;50:1168–94.</w:t>
+        <w:t xml:space="preserve">14. Wagstaff A, Paci P, Doorslaer E van. On the measurement of inequalities in health. Social Science &amp; Medicine. 1991;33:545–57.</w:t>
+      </w:r>
+      <w:r>
+        <w:t xml:space="preserve"> </w:t>
+      </w:r>
+      <w:hyperlink r:id="rId52">
+        <w:r>
+          <w:rPr>
+            <w:rStyle w:val="Hyperlink"/>
+          </w:rPr>
+          <w:t xml:space="preserve">https://doi.org/10.1016/0277-9536(91)90212-U</w:t>
+        </w:r>
+      </w:hyperlink>
+      <w:r>
+        <w:t xml:space="preserve">.</w:t>
       </w:r>
     </w:p>
     <w:bookmarkEnd w:id="53"/>
-    <w:bookmarkStart w:id="54" w:name="_b88258dff2fe74e8a283ff6e7f5f096e631d5d2"/>
+    <w:bookmarkStart w:id="55" w:name="_233e291a6f1aaf96c93131d92b645060ec50345"/>
     <w:p>
       <w:pPr>
         <w:pStyle w:val="Bibliography"/>
       </w:pPr>
       <w:r>
-        <w:t xml:space="preserve">18. Das Gupta P. Standardization and decomposition of rates: A user’s manual. U.S. Bureau of the Census; 1993.</w:t>
-      </w:r>
-    </w:p>
-    <w:bookmarkEnd w:id="54"/>
-    <w:bookmarkStart w:id="55" w:name="_46a9e99957d4eadae407149cd2f424437897d35"/>
-    <w:p>
-      <w:pPr>
-        <w:pStyle w:val="Bibliography"/>
-      </w:pPr>
-      <w:r>
-        <w:t xml:space="preserve">19. Fabic MS, Choi Y, Bongaarts J, Darroch JE, Ross JA, Stover J, et al. Meeting demand for family planning within a generation: The post-2015 agenda. The Lancet. 2015;385:1928–31.</w:t>
+        <w:t xml:space="preserve">15. Kakwani N, Wagstaff A, Doorslaer E van. Socioeconomic inequalities in health: Measurement, computation, and statistical inference. Journal of Econometrics. 1997;77:87–103.</w:t>
+      </w:r>
+      <w:r>
+        <w:t xml:space="preserve"> </w:t>
+      </w:r>
+      <w:hyperlink r:id="rId54">
+        <w:r>
+          <w:rPr>
+            <w:rStyle w:val="Hyperlink"/>
+          </w:rPr>
+          <w:t xml:space="preserve">https://doi.org/10.1016/S0304-4076(96)01807-6</w:t>
+        </w:r>
+      </w:hyperlink>
+      <w:r>
+        <w:t xml:space="preserve">.</w:t>
       </w:r>
     </w:p>
     <w:bookmarkEnd w:id="55"/>
-    <w:bookmarkStart w:id="57" w:name="_78cc7d9af08ce43be0249b471fc82c54e734aed"/>
+    <w:bookmarkStart w:id="57" w:name="_0144a4205edfd9fda0fabce33164bcf554f451b"/>
     <w:p>
       <w:pPr>
         <w:pStyle w:val="Bibliography"/>
       </w:pPr>
       <w:r>
+        <w:t xml:space="preserve">16. Erreygers G. Correcting the concentration index. Journal of Health Economics. 2009;28:504–15.</w:t>
+      </w:r>
+      <w:r>
+        <w:t xml:space="preserve"> </w:t>
+      </w:r>
+      <w:hyperlink r:id="rId56">
+        <w:r>
+          <w:rPr>
+            <w:rStyle w:val="Hyperlink"/>
+          </w:rPr>
+          <w:t xml:space="preserve">https://doi.org/10.1016/j.jhealeco.2008.02.003</w:t>
+        </w:r>
+      </w:hyperlink>
+      <w:r>
+        <w:t xml:space="preserve">.</w:t>
+      </w:r>
+    </w:p>
+    <w:bookmarkEnd w:id="57"/>
+    <w:bookmarkStart w:id="59" w:name="_2096ada8637f754eda80ca982d41947deba1be0"/>
+    <w:p>
+      <w:pPr>
+        <w:pStyle w:val="Bibliography"/>
+      </w:pPr>
+      <w:r>
+        <w:t xml:space="preserve">17. Kitagawa EM. Components of a difference between two rates. Journal of the American Statistical Association. 1955;50:1168–94.</w:t>
+      </w:r>
+      <w:r>
+        <w:t xml:space="preserve"> </w:t>
+      </w:r>
+      <w:hyperlink r:id="rId58">
+        <w:r>
+          <w:rPr>
+            <w:rStyle w:val="Hyperlink"/>
+          </w:rPr>
+          <w:t xml:space="preserve">https://doi.org/10.1080/01621459.1955.10501299</w:t>
+        </w:r>
+      </w:hyperlink>
+      <w:r>
+        <w:t xml:space="preserve">.</w:t>
+      </w:r>
+    </w:p>
+    <w:bookmarkEnd w:id="59"/>
+    <w:bookmarkStart w:id="60" w:name="_b88258dff2fe74e8a283ff6e7f5f096e631d5d2"/>
+    <w:p>
+      <w:pPr>
+        <w:pStyle w:val="Bibliography"/>
+      </w:pPr>
+      <w:r>
+        <w:t xml:space="preserve">18. Das Gupta P. Standardization and decomposition of rates: A user’s manual. U.S. Bureau of the Census; 1993.</w:t>
+      </w:r>
+    </w:p>
+    <w:bookmarkEnd w:id="60"/>
+    <w:bookmarkStart w:id="62" w:name="_46a9e99957d4eadae407149cd2f424437897d35"/>
+    <w:p>
+      <w:pPr>
+        <w:pStyle w:val="Bibliography"/>
+      </w:pPr>
+      <w:r>
+        <w:t xml:space="preserve">19. Fabic MS, Choi Y, Bongaarts J, Darroch JE, Ross JA, Stover J, et al. Meeting demand for family planning within a generation: The post-2015 agenda. The Lancet. 2015;385:1928–31.</w:t>
+      </w:r>
+      <w:r>
+        <w:t xml:space="preserve"> </w:t>
+      </w:r>
+      <w:hyperlink r:id="rId61">
+        <w:r>
+          <w:rPr>
+            <w:rStyle w:val="Hyperlink"/>
+          </w:rPr>
+          <w:t xml:space="preserve">https://doi.org/10.1016/S0140-6736(14)61055-2</w:t>
+        </w:r>
+      </w:hyperlink>
+      <w:r>
+        <w:t xml:space="preserve">.</w:t>
+      </w:r>
+    </w:p>
+    <w:bookmarkEnd w:id="62"/>
+    <w:bookmarkStart w:id="64" w:name="_78cc7d9af08ce43be0249b471fc82c54e734aed"/>
+    <w:p>
+      <w:pPr>
+        <w:pStyle w:val="Bibliography"/>
+      </w:pPr>
+      <w:r>
         <w:t xml:space="preserve">20. Rony AR, Hossen A, Asha AS, Nahin KSA. From medical necessity to private-sector dominance: A two-decade evolution of caesarean section determinants in</w:t>
       </w:r>
       <w:r>
@@ -12678,7 +12776,7 @@
       <w:r>
         <w:t xml:space="preserve"> </w:t>
       </w:r>
-      <w:hyperlink r:id="rId56">
+      <w:hyperlink r:id="rId63">
         <w:r>
           <w:rPr>
             <w:rStyle w:val="Hyperlink"/>
@@ -12690,8 +12788,8 @@
         <w:t xml:space="preserve">.</w:t>
       </w:r>
     </w:p>
-    <w:bookmarkEnd w:id="57"/>
-    <w:bookmarkStart w:id="58" w:name="_658ee18b5604f80a7fe4bfbdc797395d3f6bbde"/>
+    <w:bookmarkEnd w:id="64"/>
+    <w:bookmarkStart w:id="66" w:name="_658ee18b5604f80a7fe4bfbdc797395d3f6bbde"/>
     <w:p>
       <w:pPr>
         <w:pStyle w:val="Bibliography"/>
@@ -12699,9 +12797,23 @@
       <w:r>
         <w:t xml:space="preserve">21. Betrán AP, Ye J, Moller A-B, Zhang J, Gülmezoglu AM, Torloni MR. The increasing trend in caesarean section rates: Global, regional and national estimates: 1990-2014. PLoS ONE. 2016;11:e0148343.</w:t>
       </w:r>
+      <w:r>
+        <w:t xml:space="preserve"> </w:t>
+      </w:r>
+      <w:hyperlink r:id="rId65">
+        <w:r>
+          <w:rPr>
+            <w:rStyle w:val="Hyperlink"/>
+          </w:rPr>
+          <w:t xml:space="preserve">https://doi.org/10.1371/journal.pone.0148343</w:t>
+        </w:r>
+      </w:hyperlink>
+      <w:r>
+        <w:t xml:space="preserve">.</w:t>
+      </w:r>
     </w:p>
-    <w:bookmarkEnd w:id="58"/>
-    <w:bookmarkEnd w:id="59"/>
+    <w:bookmarkEnd w:id="66"/>
+    <w:bookmarkEnd w:id="67"/>
     <w:sectPr>
       <w:footnotePr>
         <w:numRestart w:val="eachSect"/>

</xml_diff>

<commit_message>
References: cite the DHS.rates PLOS ONE article; Cureus-formatted reference list with checked DOIs and URLs
Co-Authored-By: Claude Opus 5.5 <noreply@anthropic.com>
</commit_message>
<xml_diff>
--- a/paper/cureus/Manuscript_Cureus.docx
+++ b/paper/cureus/Manuscript_Cureus.docx
@@ -12388,7 +12388,25 @@
         <w:pStyle w:val="Bibliography"/>
       </w:pPr>
       <w:r>
-        <w:t xml:space="preserve">4. Elkasabi M.</w:t>
+        <w:t xml:space="preserve">4. Elkasabi M. Calculating fertility and childhood mortality rates from survey data using the</w:t>
+      </w:r>
+      <w:r>
+        <w:t xml:space="preserve"> </w:t>
+      </w:r>
+      <w:r>
+        <w:t xml:space="preserve">DHS.rates</w:t>
+      </w:r>
+      <w:r>
+        <w:t xml:space="preserve"> </w:t>
+      </w:r>
+      <w:r>
+        <w:t xml:space="preserve">R</w:t>
+      </w:r>
+      <w:r>
+        <w:t xml:space="preserve"> </w:t>
+      </w:r>
+      <w:r>
+        <w:t xml:space="preserve">package. PLOS ONE. 2019;14:e0216403.</w:t>
       </w:r>
       <w:r>
         <w:t xml:space="preserve"> </w:t>
@@ -12398,37 +12416,7 @@
           <w:rPr>
             <w:rStyle w:val="Hyperlink"/>
           </w:rPr>
-          <w:t xml:space="preserve">DHS.rates</w:t>
-        </w:r>
-        <w:r>
-          <w:rPr>
-            <w:rStyle w:val="Hyperlink"/>
-          </w:rPr>
-          <w:t xml:space="preserve">: Calculates key indicators such as fertility rates and infant and child mortality rates from</w:t>
-        </w:r>
-        <w:r>
-          <w:rPr>
-            <w:rStyle w:val="Hyperlink"/>
-          </w:rPr>
-          <w:t xml:space="preserve"> </w:t>
-        </w:r>
-        <w:r>
-          <w:rPr>
-            <w:rStyle w:val="Hyperlink"/>
-          </w:rPr>
-          <w:t xml:space="preserve">DHS</w:t>
-        </w:r>
-        <w:r>
-          <w:rPr>
-            <w:rStyle w:val="Hyperlink"/>
-          </w:rPr>
-          <w:t xml:space="preserve"> </w:t>
-        </w:r>
-        <w:r>
-          <w:rPr>
-            <w:rStyle w:val="Hyperlink"/>
-          </w:rPr>
-          <w:t xml:space="preserve">data</w:t>
+          <w:t xml:space="preserve">https://doi.org/10.1371/journal.pone.0216403</w:t>
         </w:r>
       </w:hyperlink>
       <w:r>

</xml_diff>

<commit_message>
References: correct Rubin (1993) title and add archive links for the two JOS papers
Co-Authored-By: Claude Opus 5.5 <noreply@anthropic.com>
</commit_message>
<xml_diff>
--- a/paper/cureus/Manuscript_Cureus.docx
+++ b/paper/cureus/Manuscript_Cureus.docx
@@ -12295,7 +12295,7 @@
       </w:r>
       <w:bookmarkEnd w:id="31"/>
     </w:p>
-    <w:bookmarkStart w:id="67" w:name="_refs"/>
+    <w:bookmarkStart w:id="69" w:name="_refs"/>
     <w:bookmarkStart w:id="32" w:name="_891bd0618677fbaff9555cad9408ba6779b4c16"/>
     <w:p>
       <w:pPr>
@@ -12558,32 +12558,60 @@
       </w:r>
     </w:p>
     <w:bookmarkEnd w:id="47"/>
-    <w:bookmarkStart w:id="48" w:name="_f0ba6b4abf465e8b253040d0875708981a2fd4c"/>
+    <w:bookmarkStart w:id="49" w:name="_f0ba6b4abf465e8b253040d0875708981a2fd4c"/>
     <w:p>
       <w:pPr>
         <w:pStyle w:val="Bibliography"/>
       </w:pPr>
       <w:r>
-        <w:t xml:space="preserve">11. Rubin DB. Statistical disclosure limitation. Journal of Official Statistics. 1993;9:461–8.</w:t>
-      </w:r>
-    </w:p>
-    <w:bookmarkEnd w:id="48"/>
-    <w:bookmarkStart w:id="49" w:name="_2f1a70716496c83e2e6a8c6df7d5edf09a024c5"/>
-    <w:p>
-      <w:pPr>
-        <w:pStyle w:val="Bibliography"/>
-      </w:pPr>
-      <w:r>
-        <w:t xml:space="preserve">12. Raghunathan TE, Reiter JP, Rubin DB. Multiple imputation for statistical disclosure limitation. Journal of Official Statistics. 2003;19:1–16.</w:t>
+        <w:t xml:space="preserve">11. Rubin DB.</w:t>
+      </w:r>
+      <w:r>
+        <w:t xml:space="preserve"> </w:t>
+      </w:r>
+      <w:hyperlink r:id="rId48">
+        <w:r>
+          <w:rPr>
+            <w:rStyle w:val="Hyperlink"/>
+          </w:rPr>
+          <w:t xml:space="preserve">Discussion: Statistical disclosure limitation</w:t>
+        </w:r>
+      </w:hyperlink>
+      <w:r>
+        <w:t xml:space="preserve">. Journal of Official Statistics. 1993;9:461–8.</w:t>
       </w:r>
     </w:p>
     <w:bookmarkEnd w:id="49"/>
-    <w:bookmarkStart w:id="51" w:name="_e1ee69be21339cb7886103462959c41dd687335"/>
+    <w:bookmarkStart w:id="51" w:name="_2f1a70716496c83e2e6a8c6df7d5edf09a024c5"/>
     <w:p>
       <w:pPr>
         <w:pStyle w:val="Bibliography"/>
       </w:pPr>
       <w:r>
+        <w:t xml:space="preserve">12. Raghunathan TE, Reiter JP, Rubin DB.</w:t>
+      </w:r>
+      <w:r>
+        <w:t xml:space="preserve"> </w:t>
+      </w:r>
+      <w:hyperlink r:id="rId50">
+        <w:r>
+          <w:rPr>
+            <w:rStyle w:val="Hyperlink"/>
+          </w:rPr>
+          <w:t xml:space="preserve">Multiple imputation for statistical disclosure limitation</w:t>
+        </w:r>
+      </w:hyperlink>
+      <w:r>
+        <w:t xml:space="preserve">. Journal of Official Statistics. 2003;19:1–16.</w:t>
+      </w:r>
+    </w:p>
+    <w:bookmarkEnd w:id="51"/>
+    <w:bookmarkStart w:id="53" w:name="_e1ee69be21339cb7886103462959c41dd687335"/>
+    <w:p>
+      <w:pPr>
+        <w:pStyle w:val="Bibliography"/>
+      </w:pPr>
+      <w:r>
         <w:t xml:space="preserve">13. Barros AJD, Victora CG. Measuring coverage in</w:t>
       </w:r>
       <w:r>
@@ -12598,7 +12626,7 @@
       <w:r>
         <w:t xml:space="preserve"> </w:t>
       </w:r>
-      <w:hyperlink r:id="rId50">
+      <w:hyperlink r:id="rId52">
         <w:r>
           <w:rPr>
             <w:rStyle w:val="Hyperlink"/>
@@ -12610,8 +12638,8 @@
         <w:t xml:space="preserve">.</w:t>
       </w:r>
     </w:p>
-    <w:bookmarkEnd w:id="51"/>
-    <w:bookmarkStart w:id="53" w:name="_82fdf24c54b33d46461562f9224269bcf5c6e6c"/>
+    <w:bookmarkEnd w:id="53"/>
+    <w:bookmarkStart w:id="55" w:name="_82fdf24c54b33d46461562f9224269bcf5c6e6c"/>
     <w:p>
       <w:pPr>
         <w:pStyle w:val="Bibliography"/>
@@ -12622,7 +12650,7 @@
       <w:r>
         <w:t xml:space="preserve"> </w:t>
       </w:r>
-      <w:hyperlink r:id="rId52">
+      <w:hyperlink r:id="rId54">
         <w:r>
           <w:rPr>
             <w:rStyle w:val="Hyperlink"/>
@@ -12634,8 +12662,8 @@
         <w:t xml:space="preserve">.</w:t>
       </w:r>
     </w:p>
-    <w:bookmarkEnd w:id="53"/>
-    <w:bookmarkStart w:id="55" w:name="_233e291a6f1aaf96c93131d92b645060ec50345"/>
+    <w:bookmarkEnd w:id="55"/>
+    <w:bookmarkStart w:id="57" w:name="_233e291a6f1aaf96c93131d92b645060ec50345"/>
     <w:p>
       <w:pPr>
         <w:pStyle w:val="Bibliography"/>
@@ -12646,7 +12674,7 @@
       <w:r>
         <w:t xml:space="preserve"> </w:t>
       </w:r>
-      <w:hyperlink r:id="rId54">
+      <w:hyperlink r:id="rId56">
         <w:r>
           <w:rPr>
             <w:rStyle w:val="Hyperlink"/>
@@ -12658,8 +12686,8 @@
         <w:t xml:space="preserve">.</w:t>
       </w:r>
     </w:p>
-    <w:bookmarkEnd w:id="55"/>
-    <w:bookmarkStart w:id="57" w:name="_0144a4205edfd9fda0fabce33164bcf554f451b"/>
+    <w:bookmarkEnd w:id="57"/>
+    <w:bookmarkStart w:id="59" w:name="_0144a4205edfd9fda0fabce33164bcf554f451b"/>
     <w:p>
       <w:pPr>
         <w:pStyle w:val="Bibliography"/>
@@ -12670,7 +12698,7 @@
       <w:r>
         <w:t xml:space="preserve"> </w:t>
       </w:r>
-      <w:hyperlink r:id="rId56">
+      <w:hyperlink r:id="rId58">
         <w:r>
           <w:rPr>
             <w:rStyle w:val="Hyperlink"/>
@@ -12682,8 +12710,8 @@
         <w:t xml:space="preserve">.</w:t>
       </w:r>
     </w:p>
-    <w:bookmarkEnd w:id="57"/>
-    <w:bookmarkStart w:id="59" w:name="_2096ada8637f754eda80ca982d41947deba1be0"/>
+    <w:bookmarkEnd w:id="59"/>
+    <w:bookmarkStart w:id="61" w:name="_2096ada8637f754eda80ca982d41947deba1be0"/>
     <w:p>
       <w:pPr>
         <w:pStyle w:val="Bibliography"/>
@@ -12694,7 +12722,7 @@
       <w:r>
         <w:t xml:space="preserve"> </w:t>
       </w:r>
-      <w:hyperlink r:id="rId58">
+      <w:hyperlink r:id="rId60">
         <w:r>
           <w:rPr>
             <w:rStyle w:val="Hyperlink"/>
@@ -12706,8 +12734,8 @@
         <w:t xml:space="preserve">.</w:t>
       </w:r>
     </w:p>
-    <w:bookmarkEnd w:id="59"/>
-    <w:bookmarkStart w:id="60" w:name="_b88258dff2fe74e8a283ff6e7f5f096e631d5d2"/>
+    <w:bookmarkEnd w:id="61"/>
+    <w:bookmarkStart w:id="62" w:name="_b88258dff2fe74e8a283ff6e7f5f096e631d5d2"/>
     <w:p>
       <w:pPr>
         <w:pStyle w:val="Bibliography"/>
@@ -12716,8 +12744,8 @@
         <w:t xml:space="preserve">18. Das Gupta P. Standardization and decomposition of rates: A user’s manual. U.S. Bureau of the Census; 1993.</w:t>
       </w:r>
     </w:p>
-    <w:bookmarkEnd w:id="60"/>
-    <w:bookmarkStart w:id="62" w:name="_46a9e99957d4eadae407149cd2f424437897d35"/>
+    <w:bookmarkEnd w:id="62"/>
+    <w:bookmarkStart w:id="64" w:name="_46a9e99957d4eadae407149cd2f424437897d35"/>
     <w:p>
       <w:pPr>
         <w:pStyle w:val="Bibliography"/>
@@ -12728,7 +12756,7 @@
       <w:r>
         <w:t xml:space="preserve"> </w:t>
       </w:r>
-      <w:hyperlink r:id="rId61">
+      <w:hyperlink r:id="rId63">
         <w:r>
           <w:rPr>
             <w:rStyle w:val="Hyperlink"/>
@@ -12740,8 +12768,8 @@
         <w:t xml:space="preserve">.</w:t>
       </w:r>
     </w:p>
-    <w:bookmarkEnd w:id="62"/>
-    <w:bookmarkStart w:id="64" w:name="_78cc7d9af08ce43be0249b471fc82c54e734aed"/>
+    <w:bookmarkEnd w:id="64"/>
+    <w:bookmarkStart w:id="66" w:name="_78cc7d9af08ce43be0249b471fc82c54e734aed"/>
     <w:p>
       <w:pPr>
         <w:pStyle w:val="Bibliography"/>
@@ -12764,7 +12792,7 @@
       <w:r>
         <w:t xml:space="preserve"> </w:t>
       </w:r>
-      <w:hyperlink r:id="rId63">
+      <w:hyperlink r:id="rId65">
         <w:r>
           <w:rPr>
             <w:rStyle w:val="Hyperlink"/>
@@ -12776,8 +12804,8 @@
         <w:t xml:space="preserve">.</w:t>
       </w:r>
     </w:p>
-    <w:bookmarkEnd w:id="64"/>
-    <w:bookmarkStart w:id="66" w:name="_658ee18b5604f80a7fe4bfbdc797395d3f6bbde"/>
+    <w:bookmarkEnd w:id="66"/>
+    <w:bookmarkStart w:id="68" w:name="_658ee18b5604f80a7fe4bfbdc797395d3f6bbde"/>
     <w:p>
       <w:pPr>
         <w:pStyle w:val="Bibliography"/>
@@ -12788,7 +12816,7 @@
       <w:r>
         <w:t xml:space="preserve"> </w:t>
       </w:r>
-      <w:hyperlink r:id="rId65">
+      <w:hyperlink r:id="rId67">
         <w:r>
           <w:rPr>
             <w:rStyle w:val="Hyperlink"/>
@@ -12800,8 +12828,8 @@
         <w:t xml:space="preserve">.</w:t>
       </w:r>
     </w:p>
-    <w:bookmarkEnd w:id="66"/>
-    <w:bookmarkEnd w:id="67"/>
+    <w:bookmarkEnd w:id="68"/>
+    <w:bookmarkEnd w:id="69"/>
     <w:sectPr>
       <w:footnotePr>
         <w:numRestart w:val="eachSect"/>

</xml_diff>